<commit_message>
Complete Lab 4 and Lab 5 documents
- Add real Word files for SRS v1.5 and v1.6. v1.6 adds exact address search
  (FR-DISC-07), equal team contributions, Diagram E, the dialog map's
  exact-address transitions, and fixes found by the AI experiment.
- Add the AI report for both coding agent exercises, and the rebuilt class.
- Add authors to the test cases and demo outline, one star feature per member,
  and updated checklists.
- Add the deliverables index, declaration of contributions and source zip.
</commit_message>
<xml_diff>
--- a/Lab4/FamPlan_Lab4_Test_Cases_v1.1.docx
+++ b/Lab4/FamPlan_Lab4_Test_Cases_v1.1.docx
@@ -238,6 +238,266 @@
                 <w:sz w:val="18"/>
                 <w:szCs w:val="18"/>
               </w:rPr>
+              <w:t>POLOYAPOY RON JOSHUA ABES (Apollo)</w:t>
+            </w:r>
+          </w:p>
+        </w:tc>
+        <w:tc>
+          <w:tcPr>
+            <w:tcW w:w="1806" w:type="dxa"/>
+            <w:tcMar>
+              <w:top w:w="50" w:type="dxa"/>
+              <w:left w:w="90" w:type="dxa"/>
+              <w:bottom w:w="50" w:type="dxa"/>
+              <w:right w:w="90" w:type="dxa"/>
+            </w:tcMar>
+          </w:tcPr>
+          <w:p>
+            <w:r>
+              <w:rPr>
+                <w:sz w:val="18"/>
+                <w:szCs w:val="18"/>
+              </w:rPr>
+              <w:t>POLO0002</w:t>
+            </w:r>
+          </w:p>
+        </w:tc>
+      </w:tr>
+      <w:tr>
+        <w:trPr>
+          <w:cantSplit/>
+        </w:trPr>
+        <w:tc>
+          <w:tcPr>
+            <w:tcW w:w="3610" w:type="dxa"/>
+            <w:tcMar>
+              <w:top w:w="50" w:type="dxa"/>
+              <w:left w:w="90" w:type="dxa"/>
+              <w:bottom w:w="50" w:type="dxa"/>
+              <w:right w:w="90" w:type="dxa"/>
+            </w:tcMar>
+          </w:tcPr>
+          <w:p>
+            <w:r>
+              <w:rPr>
+                <w:sz w:val="18"/>
+                <w:szCs w:val="18"/>
+              </w:rPr>
+              <w:t>Test cases, test code and testing results</w:t>
+            </w:r>
+          </w:p>
+        </w:tc>
+        <w:tc>
+          <w:tcPr>
+            <w:tcW w:w="3610" w:type="dxa"/>
+            <w:tcMar>
+              <w:top w:w="50" w:type="dxa"/>
+              <w:left w:w="90" w:type="dxa"/>
+              <w:bottom w:w="50" w:type="dxa"/>
+              <w:right w:w="90" w:type="dxa"/>
+            </w:tcMar>
+          </w:tcPr>
+          <w:p>
+            <w:r>
+              <w:rPr>
+                <w:sz w:val="18"/>
+                <w:szCs w:val="18"/>
+              </w:rPr>
+              <w:t>LIM RUI XIAN EDWARD</w:t>
+            </w:r>
+          </w:p>
+        </w:tc>
+        <w:tc>
+          <w:tcPr>
+            <w:tcW w:w="1806" w:type="dxa"/>
+            <w:tcMar>
+              <w:top w:w="50" w:type="dxa"/>
+              <w:left w:w="90" w:type="dxa"/>
+              <w:bottom w:w="50" w:type="dxa"/>
+              <w:right w:w="90" w:type="dxa"/>
+            </w:tcMar>
+          </w:tcPr>
+          <w:p>
+            <w:r>
+              <w:rPr>
+                <w:sz w:val="18"/>
+                <w:szCs w:val="18"/>
+              </w:rPr>
+              <w:t>ELIM095</w:t>
+            </w:r>
+          </w:p>
+        </w:tc>
+      </w:tr>
+      <w:tr>
+        <w:trPr>
+          <w:cantSplit/>
+        </w:trPr>
+        <w:tc>
+          <w:tcPr>
+            <w:tcW w:w="3610" w:type="dxa"/>
+            <w:tcMar>
+              <w:top w:w="50" w:type="dxa"/>
+              <w:left w:w="90" w:type="dxa"/>
+              <w:bottom w:w="50" w:type="dxa"/>
+              <w:right w:w="90" w:type="dxa"/>
+            </w:tcMar>
+          </w:tcPr>
+          <w:p>
+            <w:r>
+              <w:rPr>
+                <w:sz w:val="18"/>
+                <w:szCs w:val="18"/>
+              </w:rPr>
+              <w:t>Test cases, test code and testing results</w:t>
+            </w:r>
+          </w:p>
+        </w:tc>
+        <w:tc>
+          <w:tcPr>
+            <w:tcW w:w="3610" w:type="dxa"/>
+            <w:tcMar>
+              <w:top w:w="50" w:type="dxa"/>
+              <w:left w:w="90" w:type="dxa"/>
+              <w:bottom w:w="50" w:type="dxa"/>
+              <w:right w:w="90" w:type="dxa"/>
+            </w:tcMar>
+          </w:tcPr>
+          <w:p>
+            <w:r>
+              <w:rPr>
+                <w:sz w:val="18"/>
+                <w:szCs w:val="18"/>
+              </w:rPr>
+              <w:t>LE VIET HOANG ANH (Raphael)</w:t>
+            </w:r>
+          </w:p>
+        </w:tc>
+        <w:tc>
+          <w:tcPr>
+            <w:tcW w:w="1806" w:type="dxa"/>
+            <w:tcMar>
+              <w:top w:w="50" w:type="dxa"/>
+              <w:left w:w="90" w:type="dxa"/>
+              <w:bottom w:w="50" w:type="dxa"/>
+              <w:right w:w="90" w:type="dxa"/>
+            </w:tcMar>
+          </w:tcPr>
+          <w:p>
+            <w:r>
+              <w:rPr>
+                <w:sz w:val="18"/>
+                <w:szCs w:val="18"/>
+              </w:rPr>
+              <w:t>HOANGANH003</w:t>
+            </w:r>
+          </w:p>
+        </w:tc>
+      </w:tr>
+      <w:tr>
+        <w:trPr>
+          <w:cantSplit/>
+        </w:trPr>
+        <w:tc>
+          <w:tcPr>
+            <w:tcW w:w="3610" w:type="dxa"/>
+            <w:tcMar>
+              <w:top w:w="50" w:type="dxa"/>
+              <w:left w:w="90" w:type="dxa"/>
+              <w:bottom w:w="50" w:type="dxa"/>
+              <w:right w:w="90" w:type="dxa"/>
+            </w:tcMar>
+          </w:tcPr>
+          <w:p>
+            <w:r>
+              <w:rPr>
+                <w:sz w:val="18"/>
+                <w:szCs w:val="18"/>
+              </w:rPr>
+              <w:t>Test cases, test code and testing results</w:t>
+            </w:r>
+          </w:p>
+        </w:tc>
+        <w:tc>
+          <w:tcPr>
+            <w:tcW w:w="3610" w:type="dxa"/>
+            <w:tcMar>
+              <w:top w:w="50" w:type="dxa"/>
+              <w:left w:w="90" w:type="dxa"/>
+              <w:bottom w:w="50" w:type="dxa"/>
+              <w:right w:w="90" w:type="dxa"/>
+            </w:tcMar>
+          </w:tcPr>
+          <w:p>
+            <w:r>
+              <w:rPr>
+                <w:sz w:val="18"/>
+                <w:szCs w:val="18"/>
+              </w:rPr>
+              <w:t>ATHENA LIM HUI RU (LIN HUIRU)</w:t>
+            </w:r>
+          </w:p>
+        </w:tc>
+        <w:tc>
+          <w:tcPr>
+            <w:tcW w:w="1806" w:type="dxa"/>
+            <w:tcMar>
+              <w:top w:w="50" w:type="dxa"/>
+              <w:left w:w="90" w:type="dxa"/>
+              <w:bottom w:w="50" w:type="dxa"/>
+              <w:right w:w="90" w:type="dxa"/>
+            </w:tcMar>
+          </w:tcPr>
+          <w:p>
+            <w:r>
+              <w:rPr>
+                <w:sz w:val="18"/>
+                <w:szCs w:val="18"/>
+              </w:rPr>
+              <w:t>ALIM102</w:t>
+            </w:r>
+          </w:p>
+        </w:tc>
+      </w:tr>
+      <w:tr>
+        <w:trPr>
+          <w:cantSplit/>
+        </w:trPr>
+        <w:tc>
+          <w:tcPr>
+            <w:tcW w:w="3610" w:type="dxa"/>
+            <w:tcMar>
+              <w:top w:w="50" w:type="dxa"/>
+              <w:left w:w="90" w:type="dxa"/>
+              <w:bottom w:w="50" w:type="dxa"/>
+              <w:right w:w="90" w:type="dxa"/>
+            </w:tcMar>
+          </w:tcPr>
+          <w:p>
+            <w:r>
+              <w:rPr>
+                <w:sz w:val="18"/>
+                <w:szCs w:val="18"/>
+              </w:rPr>
+              <w:t>Test cases, test code and testing results</w:t>
+            </w:r>
+          </w:p>
+        </w:tc>
+        <w:tc>
+          <w:tcPr>
+            <w:tcW w:w="3610" w:type="dxa"/>
+            <w:tcMar>
+              <w:top w:w="50" w:type="dxa"/>
+              <w:left w:w="90" w:type="dxa"/>
+              <w:bottom w:w="50" w:type="dxa"/>
+              <w:right w:w="90" w:type="dxa"/>
+            </w:tcMar>
+          </w:tcPr>
+          <w:p>
+            <w:r>
+              <w:rPr>
+                <w:sz w:val="18"/>
+                <w:szCs w:val="18"/>
+              </w:rPr>
               <w:t>MUHAMMAD ILHAM BIN IRWAN</w:t>
             </w:r>
           </w:p>
@@ -549,7 +809,7 @@
           <w:r>
             <w:fldChar w:fldCharType="separate"/>
           </w:r>
-          <w:hyperlink w:anchor="_Toc244363439" w:history="1">
+          <w:hyperlink w:anchor="_Toc244368934" w:history="1">
             <w:r>
               <w:rPr>
                 <w:rStyle w:val="Hyperlink"/>
@@ -573,7 +833,7 @@
               <w:rPr>
                 <w:noProof/>
               </w:rPr>
-              <w:instrText xml:space="preserve"> PAGEREF _Toc244363439 \h </w:instrText>
+              <w:instrText xml:space="preserve"> PAGEREF _Toc244368934 \h </w:instrText>
             </w:r>
             <w:r>
               <w:rPr>
@@ -616,7 +876,7 @@
               <w14:ligatures w14:val="standardContextual"/>
             </w:rPr>
           </w:pPr>
-          <w:hyperlink w:anchor="_Toc244363440" w:history="1">
+          <w:hyperlink w:anchor="_Toc244368935" w:history="1">
             <w:r>
               <w:rPr>
                 <w:rStyle w:val="Hyperlink"/>
@@ -640,7 +900,7 @@
               <w:rPr>
                 <w:noProof/>
               </w:rPr>
-              <w:instrText xml:space="preserve"> PAGEREF _Toc244363440 \h </w:instrText>
+              <w:instrText xml:space="preserve"> PAGEREF _Toc244368935 \h </w:instrText>
             </w:r>
             <w:r>
               <w:rPr>
@@ -683,7 +943,7 @@
               <w14:ligatures w14:val="standardContextual"/>
             </w:rPr>
           </w:pPr>
-          <w:hyperlink w:anchor="_Toc244363441" w:history="1">
+          <w:hyperlink w:anchor="_Toc244368936" w:history="1">
             <w:r>
               <w:rPr>
                 <w:rStyle w:val="Hyperlink"/>
@@ -707,7 +967,7 @@
               <w:rPr>
                 <w:noProof/>
               </w:rPr>
-              <w:instrText xml:space="preserve"> PAGEREF _Toc244363441 \h </w:instrText>
+              <w:instrText xml:space="preserve"> PAGEREF _Toc244368936 \h </w:instrText>
             </w:r>
             <w:r>
               <w:rPr>
@@ -750,7 +1010,7 @@
               <w14:ligatures w14:val="standardContextual"/>
             </w:rPr>
           </w:pPr>
-          <w:hyperlink w:anchor="_Toc244363442" w:history="1">
+          <w:hyperlink w:anchor="_Toc244368937" w:history="1">
             <w:r>
               <w:rPr>
                 <w:rStyle w:val="Hyperlink"/>
@@ -774,7 +1034,7 @@
               <w:rPr>
                 <w:noProof/>
               </w:rPr>
-              <w:instrText xml:space="preserve"> PAGEREF _Toc244363442 \h </w:instrText>
+              <w:instrText xml:space="preserve"> PAGEREF _Toc244368937 \h </w:instrText>
             </w:r>
             <w:r>
               <w:rPr>
@@ -817,7 +1077,7 @@
               <w14:ligatures w14:val="standardContextual"/>
             </w:rPr>
           </w:pPr>
-          <w:hyperlink w:anchor="_Toc244363443" w:history="1">
+          <w:hyperlink w:anchor="_Toc244368938" w:history="1">
             <w:r>
               <w:rPr>
                 <w:rStyle w:val="Hyperlink"/>
@@ -841,7 +1101,7 @@
               <w:rPr>
                 <w:noProof/>
               </w:rPr>
-              <w:instrText xml:space="preserve"> PAGEREF _Toc244363443 \h </w:instrText>
+              <w:instrText xml:space="preserve"> PAGEREF _Toc244368938 \h </w:instrText>
             </w:r>
             <w:r>
               <w:rPr>
@@ -884,7 +1144,7 @@
               <w14:ligatures w14:val="standardContextual"/>
             </w:rPr>
           </w:pPr>
-          <w:hyperlink w:anchor="_Toc244363444" w:history="1">
+          <w:hyperlink w:anchor="_Toc244368939" w:history="1">
             <w:r>
               <w:rPr>
                 <w:rStyle w:val="Hyperlink"/>
@@ -908,7 +1168,7 @@
               <w:rPr>
                 <w:noProof/>
               </w:rPr>
-              <w:instrText xml:space="preserve"> PAGEREF _Toc244363444 \h </w:instrText>
+              <w:instrText xml:space="preserve"> PAGEREF _Toc244368939 \h </w:instrText>
             </w:r>
             <w:r>
               <w:rPr>
@@ -951,7 +1211,7 @@
               <w14:ligatures w14:val="standardContextual"/>
             </w:rPr>
           </w:pPr>
-          <w:hyperlink w:anchor="_Toc244363445" w:history="1">
+          <w:hyperlink w:anchor="_Toc244368940" w:history="1">
             <w:r>
               <w:rPr>
                 <w:rStyle w:val="Hyperlink"/>
@@ -975,7 +1235,7 @@
               <w:rPr>
                 <w:noProof/>
               </w:rPr>
-              <w:instrText xml:space="preserve"> PAGEREF _Toc244363445 \h </w:instrText>
+              <w:instrText xml:space="preserve"> PAGEREF _Toc244368940 \h </w:instrText>
             </w:r>
             <w:r>
               <w:rPr>
@@ -1018,7 +1278,7 @@
               <w14:ligatures w14:val="standardContextual"/>
             </w:rPr>
           </w:pPr>
-          <w:hyperlink w:anchor="_Toc244363446" w:history="1">
+          <w:hyperlink w:anchor="_Toc244368941" w:history="1">
             <w:r>
               <w:rPr>
                 <w:rStyle w:val="Hyperlink"/>
@@ -1042,7 +1302,7 @@
               <w:rPr>
                 <w:noProof/>
               </w:rPr>
-              <w:instrText xml:space="preserve"> PAGEREF _Toc244363446 \h </w:instrText>
+              <w:instrText xml:space="preserve"> PAGEREF _Toc244368941 \h </w:instrText>
             </w:r>
             <w:r>
               <w:rPr>
@@ -1085,7 +1345,7 @@
               <w14:ligatures w14:val="standardContextual"/>
             </w:rPr>
           </w:pPr>
-          <w:hyperlink w:anchor="_Toc244363447" w:history="1">
+          <w:hyperlink w:anchor="_Toc244368942" w:history="1">
             <w:r>
               <w:rPr>
                 <w:rStyle w:val="Hyperlink"/>
@@ -1109,7 +1369,7 @@
               <w:rPr>
                 <w:noProof/>
               </w:rPr>
-              <w:instrText xml:space="preserve"> PAGEREF _Toc244363447 \h </w:instrText>
+              <w:instrText xml:space="preserve"> PAGEREF _Toc244368942 \h </w:instrText>
             </w:r>
             <w:r>
               <w:rPr>
@@ -1152,7 +1412,7 @@
               <w14:ligatures w14:val="standardContextual"/>
             </w:rPr>
           </w:pPr>
-          <w:hyperlink w:anchor="_Toc244363448" w:history="1">
+          <w:hyperlink w:anchor="_Toc244368943" w:history="1">
             <w:r>
               <w:rPr>
                 <w:rStyle w:val="Hyperlink"/>
@@ -1176,7 +1436,7 @@
               <w:rPr>
                 <w:noProof/>
               </w:rPr>
-              <w:instrText xml:space="preserve"> PAGEREF _Toc244363448 \h </w:instrText>
+              <w:instrText xml:space="preserve"> PAGEREF _Toc244368943 \h </w:instrText>
             </w:r>
             <w:r>
               <w:rPr>
@@ -1219,7 +1479,7 @@
               <w14:ligatures w14:val="standardContextual"/>
             </w:rPr>
           </w:pPr>
-          <w:hyperlink w:anchor="_Toc244363449" w:history="1">
+          <w:hyperlink w:anchor="_Toc244368944" w:history="1">
             <w:r>
               <w:rPr>
                 <w:rStyle w:val="Hyperlink"/>
@@ -1243,7 +1503,7 @@
               <w:rPr>
                 <w:noProof/>
               </w:rPr>
-              <w:instrText xml:space="preserve"> PAGEREF _Toc244363449 \h </w:instrText>
+              <w:instrText xml:space="preserve"> PAGEREF _Toc244368944 \h </w:instrText>
             </w:r>
             <w:r>
               <w:rPr>
@@ -1286,7 +1546,7 @@
               <w14:ligatures w14:val="standardContextual"/>
             </w:rPr>
           </w:pPr>
-          <w:hyperlink w:anchor="_Toc244363450" w:history="1">
+          <w:hyperlink w:anchor="_Toc244368945" w:history="1">
             <w:r>
               <w:rPr>
                 <w:rStyle w:val="Hyperlink"/>
@@ -1310,7 +1570,7 @@
               <w:rPr>
                 <w:noProof/>
               </w:rPr>
-              <w:instrText xml:space="preserve"> PAGEREF _Toc244363450 \h </w:instrText>
+              <w:instrText xml:space="preserve"> PAGEREF _Toc244368945 \h </w:instrText>
             </w:r>
             <w:r>
               <w:rPr>
@@ -1353,7 +1613,7 @@
               <w14:ligatures w14:val="standardContextual"/>
             </w:rPr>
           </w:pPr>
-          <w:hyperlink w:anchor="_Toc244363451" w:history="1">
+          <w:hyperlink w:anchor="_Toc244368946" w:history="1">
             <w:r>
               <w:rPr>
                 <w:rStyle w:val="Hyperlink"/>
@@ -1377,7 +1637,7 @@
               <w:rPr>
                 <w:noProof/>
               </w:rPr>
-              <w:instrText xml:space="preserve"> PAGEREF _Toc244363451 \h </w:instrText>
+              <w:instrText xml:space="preserve"> PAGEREF _Toc244368946 \h </w:instrText>
             </w:r>
             <w:r>
               <w:rPr>
@@ -1420,7 +1680,7 @@
               <w14:ligatures w14:val="standardContextual"/>
             </w:rPr>
           </w:pPr>
-          <w:hyperlink w:anchor="_Toc244363452" w:history="1">
+          <w:hyperlink w:anchor="_Toc244368947" w:history="1">
             <w:r>
               <w:rPr>
                 <w:rStyle w:val="Hyperlink"/>
@@ -1444,7 +1704,7 @@
               <w:rPr>
                 <w:noProof/>
               </w:rPr>
-              <w:instrText xml:space="preserve"> PAGEREF _Toc244363452 \h </w:instrText>
+              <w:instrText xml:space="preserve"> PAGEREF _Toc244368947 \h </w:instrText>
             </w:r>
             <w:r>
               <w:rPr>
@@ -1487,7 +1747,7 @@
               <w14:ligatures w14:val="standardContextual"/>
             </w:rPr>
           </w:pPr>
-          <w:hyperlink w:anchor="_Toc244363453" w:history="1">
+          <w:hyperlink w:anchor="_Toc244368948" w:history="1">
             <w:r>
               <w:rPr>
                 <w:rStyle w:val="Hyperlink"/>
@@ -1511,7 +1771,7 @@
               <w:rPr>
                 <w:noProof/>
               </w:rPr>
-              <w:instrText xml:space="preserve"> PAGEREF _Toc244363453 \h </w:instrText>
+              <w:instrText xml:space="preserve"> PAGEREF _Toc244368948 \h </w:instrText>
             </w:r>
             <w:r>
               <w:rPr>
@@ -1554,7 +1814,7 @@
               <w14:ligatures w14:val="standardContextual"/>
             </w:rPr>
           </w:pPr>
-          <w:hyperlink w:anchor="_Toc244363454" w:history="1">
+          <w:hyperlink w:anchor="_Toc244368949" w:history="1">
             <w:r>
               <w:rPr>
                 <w:rStyle w:val="Hyperlink"/>
@@ -1578,7 +1838,7 @@
               <w:rPr>
                 <w:noProof/>
               </w:rPr>
-              <w:instrText xml:space="preserve"> PAGEREF _Toc244363454 \h </w:instrText>
+              <w:instrText xml:space="preserve"> PAGEREF _Toc244368949 \h </w:instrText>
             </w:r>
             <w:r>
               <w:rPr>
@@ -1621,7 +1881,7 @@
               <w14:ligatures w14:val="standardContextual"/>
             </w:rPr>
           </w:pPr>
-          <w:hyperlink w:anchor="_Toc244363455" w:history="1">
+          <w:hyperlink w:anchor="_Toc244368950" w:history="1">
             <w:r>
               <w:rPr>
                 <w:rStyle w:val="Hyperlink"/>
@@ -1645,7 +1905,7 @@
               <w:rPr>
                 <w:noProof/>
               </w:rPr>
-              <w:instrText xml:space="preserve"> PAGEREF _Toc244363455 \h </w:instrText>
+              <w:instrText xml:space="preserve"> PAGEREF _Toc244368950 \h </w:instrText>
             </w:r>
             <w:r>
               <w:rPr>
@@ -1688,7 +1948,7 @@
               <w14:ligatures w14:val="standardContextual"/>
             </w:rPr>
           </w:pPr>
-          <w:hyperlink w:anchor="_Toc244363456" w:history="1">
+          <w:hyperlink w:anchor="_Toc244368951" w:history="1">
             <w:r>
               <w:rPr>
                 <w:rStyle w:val="Hyperlink"/>
@@ -1712,7 +1972,7 @@
               <w:rPr>
                 <w:noProof/>
               </w:rPr>
-              <w:instrText xml:space="preserve"> PAGEREF _Toc244363456 \h </w:instrText>
+              <w:instrText xml:space="preserve"> PAGEREF _Toc244368951 \h </w:instrText>
             </w:r>
             <w:r>
               <w:rPr>
@@ -1756,7 +2016,7 @@
         <w:pStyle w:val="Heading1"/>
         <w:spacing w:before="240" w:after="120"/>
       </w:pPr>
-      <w:bookmarkStart w:id="0" w:name="_Toc244363439"/>
+      <w:bookmarkStart w:id="0" w:name="_Toc244368934"/>
       <w:r>
         <w:lastRenderedPageBreak/>
         <w:t>1. Introduction</w:t>
@@ -1768,7 +2028,7 @@
         <w:pStyle w:val="Heading2"/>
         <w:spacing w:before="180" w:after="120"/>
       </w:pPr>
-      <w:bookmarkStart w:id="1" w:name="_Toc244363440"/>
+      <w:bookmarkStart w:id="1" w:name="_Toc244368935"/>
       <w:r>
         <w:t>1.1 Purpose and scope</w:t>
       </w:r>
@@ -1834,7 +2094,7 @@
         <w:pStyle w:val="Heading2"/>
         <w:spacing w:before="180" w:after="120"/>
       </w:pPr>
-      <w:bookmarkStart w:id="2" w:name="_Toc244363441"/>
+      <w:bookmarkStart w:id="2" w:name="_Toc244368936"/>
       <w:r>
         <w:t>1.2 Test environment</w:t>
       </w:r>
@@ -2259,7 +2519,7 @@
         <w:pStyle w:val="Heading1"/>
         <w:spacing w:before="240" w:after="120"/>
       </w:pPr>
-      <w:bookmarkStart w:id="3" w:name="_Toc244363442"/>
+      <w:bookmarkStart w:id="3" w:name="_Toc244368937"/>
       <w:r>
         <w:t>2. Black-box Testing: ScoringController</w:t>
       </w:r>
@@ -2270,7 +2530,7 @@
         <w:pStyle w:val="Heading2"/>
         <w:spacing w:before="180" w:after="120"/>
       </w:pPr>
-      <w:bookmarkStart w:id="4" w:name="_Toc244363443"/>
+      <w:bookmarkStart w:id="4" w:name="_Toc244368938"/>
       <w:r>
         <w:t>2.1 Class under test</w:t>
       </w:r>
@@ -2629,7 +2889,7 @@
         <w:pStyle w:val="Heading2"/>
         <w:spacing w:before="180" w:after="120"/>
       </w:pPr>
-      <w:bookmarkStart w:id="5" w:name="_Toc244363444"/>
+      <w:bookmarkStart w:id="5" w:name="_Toc244368939"/>
       <w:r>
         <w:t>2.2 Equivalence classes</w:t>
       </w:r>
@@ -5201,7 +5461,7 @@
         <w:pStyle w:val="Heading2"/>
         <w:spacing w:before="180" w:after="120"/>
       </w:pPr>
-      <w:bookmarkStart w:id="6" w:name="_Toc244363445"/>
+      <w:bookmarkStart w:id="6" w:name="_Toc244368940"/>
       <w:r>
         <w:t>2.3 Boundary values</w:t>
       </w:r>
@@ -6229,7 +6489,7 @@
         <w:pStyle w:val="Heading2"/>
         <w:spacing w:before="180" w:after="120"/>
       </w:pPr>
-      <w:bookmarkStart w:id="7" w:name="_Toc244363446"/>
+      <w:bookmarkStart w:id="7" w:name="_Toc244368941"/>
       <w:r>
         <w:t>2.4 Test cases and results</w:t>
       </w:r>
@@ -11668,7 +11928,7 @@
         <w:pStyle w:val="Heading2"/>
         <w:spacing w:before="180" w:after="120"/>
       </w:pPr>
-      <w:bookmarkStart w:id="8" w:name="_Toc244363447"/>
+      <w:bookmarkStart w:id="8" w:name="_Toc244368942"/>
       <w:r>
         <w:t>2.5 Minimising the number of test cases</w:t>
       </w:r>
@@ -11731,7 +11991,7 @@
         <w:pStyle w:val="Heading1"/>
         <w:spacing w:before="240" w:after="120"/>
       </w:pPr>
-      <w:bookmarkStart w:id="9" w:name="_Toc244363448"/>
+      <w:bookmarkStart w:id="9" w:name="_Toc244368943"/>
       <w:r>
         <w:lastRenderedPageBreak/>
         <w:t>3. White-box Testing: Basis Path Testing</w:t>
@@ -11751,7 +12011,7 @@
         <w:pStyle w:val="Heading2"/>
         <w:spacing w:before="180" w:after="120"/>
       </w:pPr>
-      <w:bookmarkStart w:id="10" w:name="_Toc244363449"/>
+      <w:bookmarkStart w:id="10" w:name="_Toc244368944"/>
       <w:r>
         <w:t>3.1 WB1: ScoringController.calculateScore()</w:t>
       </w:r>
@@ -15216,7 +15476,7 @@
         <w:pStyle w:val="Heading2"/>
         <w:spacing w:before="180" w:after="120"/>
       </w:pPr>
-      <w:bookmarkStart w:id="11" w:name="_Toc244363450"/>
+      <w:bookmarkStart w:id="11" w:name="_Toc244368945"/>
       <w:r>
         <w:t>3.2 WB2: dedupeFacilities()</w:t>
       </w:r>
@@ -17418,7 +17678,7 @@
         <w:pStyle w:val="Heading2"/>
         <w:spacing w:before="180" w:after="120"/>
       </w:pPr>
-      <w:bookmarkStart w:id="12" w:name="_Toc244363451"/>
+      <w:bookmarkStart w:id="12" w:name="_Toc244368946"/>
       <w:r>
         <w:t>3.3 Checking that the tests can fail</w:t>
       </w:r>
@@ -17653,7 +17913,7 @@
         <w:pStyle w:val="Heading1"/>
         <w:spacing w:before="240" w:after="120"/>
       </w:pPr>
-      <w:bookmarkStart w:id="13" w:name="_Toc244363452"/>
+      <w:bookmarkStart w:id="13" w:name="_Toc244368947"/>
       <w:r>
         <w:t>4. Test Execution Summary</w:t>
       </w:r>
@@ -17680,7 +17940,7 @@
         <w:pStyle w:val="Heading2"/>
         <w:spacing w:before="180" w:after="120"/>
       </w:pPr>
-      <w:bookmarkStart w:id="14" w:name="_Toc244363453"/>
+      <w:bookmarkStart w:id="14" w:name="_Toc244368948"/>
       <w:r>
         <w:t>4.1 Additional tests for NFR-MAINT-02</w:t>
       </w:r>
@@ -18693,7 +18953,7 @@
         <w:pStyle w:val="Heading2"/>
         <w:spacing w:before="180" w:after="120"/>
       </w:pPr>
-      <w:bookmarkStart w:id="15" w:name="_Toc244363454"/>
+      <w:bookmarkStart w:id="15" w:name="_Toc244368949"/>
       <w:r>
         <w:t>4.2 Additional tests for travel modes and multiple commute destinations</w:t>
       </w:r>
@@ -20021,7 +20281,7 @@
         <w:pStyle w:val="Heading2"/>
         <w:spacing w:before="180" w:after="120"/>
       </w:pPr>
-      <w:bookmarkStart w:id="16" w:name="_Toc244363455"/>
+      <w:bookmarkStart w:id="16" w:name="_Toc244368950"/>
       <w:r>
         <w:t>4.3 Local load test (NFR-SCALE-02)</w:t>
       </w:r>
@@ -20508,7 +20768,7 @@
         <w:pStyle w:val="Heading1"/>
         <w:spacing w:before="240" w:after="120"/>
       </w:pPr>
-      <w:bookmarkStart w:id="17" w:name="_Toc244363456"/>
+      <w:bookmarkStart w:id="17" w:name="_Toc244368951"/>
       <w:r>
         <w:t>5. Traceability: Requirements to Tests</w:t>
       </w:r>

</xml_diff>